<commit_message>
Training as a module-by-module course, nothing to sign
The workforce training is now taken inside the assistant one module at a
time, each followed by its own questions with feedback and saved progress
(POST /api/training/modules/:id). Passing every module, or the full check,
completes the training; the acknowledgment signature step is gone from the
app and from the documents. The risk analysis and the policies close with
an approval table (role, name, date) instead of signature lines, and the
documentation page no longer asks the clinic to sign anything. The quiz has
twelve questions (passing score ten) and the training document is version
1.2.

Co-Authored-By: Claude Fable 5.1 <noreply@anthropic.com>
Claude-Session: https://claude.ai/code/session_01MCrTcTwyNPkxe2hPsDC8bD
</commit_message>
<xml_diff>
--- a/packages/web/public/docs/Helixona-Assistant-Policies-and-Procedures.docx
+++ b/packages/web/public/docs/Helixona-Assistant-Policies-and-Procedures.docx
@@ -400,7 +400,7 @@
           <w:sz w:val="20"/>
           <w:szCs w:val="20"/>
         </w:rPr>
-        <w:t xml:space="preserve">Fill in the bracketed fields, review with the clinic's Privacy Officer and Security Officer, and keep the signed copy with the compliance records for at least six years. Legal review is recommended before adoption.</w:t>
+        <w:t xml:space="preserve">Fill in the bracketed fields, review with the clinic's Privacy Officer and Security Officer, and keep a copy with the compliance records for at least six years. Legal review is recommended before adoption.</w:t>
       </w:r>
     </w:p>
     <w:p>
@@ -1018,7 +1018,7 @@
         <w:spacing w:after="60" w:line="276"/>
       </w:pPr>
       <w:r>
-        <w:t xml:space="preserve">Onboarding: the manager requests access; the Privacy Officer approves; the user completes training and signs the acknowledgment; an administrator creates the account from the Administration page; the user receives a temporary password by email and, at first sign-in, sets a password and enrolls an authenticator app.</w:t>
+        <w:t xml:space="preserve">Onboarding: the manager requests access; the Privacy Officer approves; an administrator creates the account from the Administration page; the user receives a temporary password by email and, at first sign-in, sets a password, enrolls an authenticator app and completes the training inside the assistant before their first conversation.</w:t>
       </w:r>
     </w:p>
     <w:p>
@@ -1902,7 +1902,7 @@
         <w:spacing w:after="60" w:line="276"/>
       </w:pPr>
       <w:r>
-        <w:t xml:space="preserve">Every workforce member completes the Helixona Assistant HIPAA training and signs the acknowledgment before their first sign-in, yearly afterwards, and whenever these policies change materially.</w:t>
+        <w:t xml:space="preserve">Every workforce member completes the Helixona Assistant HIPAA training before their first conversation with the assistant, yearly afterwards, and whenever these policies change materially. Completion is recorded in the training log; no signature is required.</w:t>
       </w:r>
     </w:p>
     <w:p>
@@ -2268,6 +2268,14 @@
         <w:t xml:space="preserve">Approval</w:t>
       </w:r>
     </w:p>
+    <w:p>
+      <w:pPr>
+        <w:spacing w:after="120" w:line="276"/>
+      </w:pPr>
+      <w:r>
+        <w:t xml:space="preserve">Reviewed and approved by the people below. No signature is required: the approval is recorded here, with the name and the date.</w:t>
+      </w:r>
+    </w:p>
     <w:tbl>
       <w:tblPr>
         <w:tblW w:type="dxa" w:w="9360"/>
@@ -2313,7 +2321,7 @@
                 <w:sz w:val="18"/>
                 <w:szCs w:val="18"/>
               </w:rPr>
-              <w:t xml:space="preserve">Name and role</w:t>
+              <w:t xml:space="preserve">Role</w:t>
             </w:r>
           </w:p>
         </w:tc>
@@ -2341,7 +2349,7 @@
                 <w:sz w:val="18"/>
                 <w:szCs w:val="18"/>
               </w:rPr>
-              <w:t xml:space="preserve">Signature</w:t>
+              <w:t xml:space="preserve">Name</w:t>
             </w:r>
           </w:p>
         </w:tc>
@@ -2375,9 +2383,6 @@
         </w:tc>
       </w:tr>
       <w:tr>
-        <w:trPr>
-          <w:trHeight w:val="700" w:hRule="atLeast"/>
-        </w:trPr>
         <w:tc>
           <w:tcPr>
             <w:tcW w:type="dxa" w:w="3400"/>
@@ -2395,10 +2400,12 @@
             </w:pPr>
             <w:r>
               <w:rPr>
-                <w:sz w:val="18"/>
-                <w:szCs w:val="18"/>
-              </w:rPr>
-              <w:t xml:space="preserve">[Name], Owner / Medical Director</w:t>
+                <w:b/>
+                <w:bCs/>
+                <w:sz w:val="18"/>
+                <w:szCs w:val="18"/>
+              </w:rPr>
+              <w:t xml:space="preserve">Owner / Medical Director</w:t>
             </w:r>
           </w:p>
         </w:tc>
@@ -2419,10 +2426,12 @@
             </w:pPr>
             <w:r>
               <w:rPr>
-                <w:sz w:val="18"/>
-                <w:szCs w:val="18"/>
-              </w:rPr>
-              <w:t xml:space="preserve"/>
+                <w:b w:val="false"/>
+                <w:bCs w:val="false"/>
+                <w:sz w:val="18"/>
+                <w:szCs w:val="18"/>
+              </w:rPr>
+              <w:t xml:space="preserve">[Name]</w:t>
             </w:r>
           </w:p>
         </w:tc>
@@ -2443,95 +2452,100 @@
             </w:pPr>
             <w:r>
               <w:rPr>
-                <w:sz w:val="18"/>
-                <w:szCs w:val="18"/>
-              </w:rPr>
-              <w:t xml:space="preserve"/>
+                <w:b w:val="false"/>
+                <w:bCs w:val="false"/>
+                <w:sz w:val="18"/>
+                <w:szCs w:val="18"/>
+              </w:rPr>
+              <w:t xml:space="preserve">[Date]</w:t>
             </w:r>
           </w:p>
         </w:tc>
       </w:tr>
       <w:tr>
-        <w:trPr>
-          <w:trHeight w:val="700" w:hRule="atLeast"/>
-        </w:trPr>
         <w:tc>
           <w:tcPr>
             <w:tcW w:type="dxa" w:w="3400"/>
-            <w:tcMar>
-              <w:top w:type="dxa" w:w="60"/>
-              <w:left w:type="dxa" w:w="100"/>
-              <w:bottom w:type="dxa" w:w="60"/>
-              <w:right w:type="dxa" w:w="100"/>
-            </w:tcMar>
-            <w:vAlign w:val="top"/>
-          </w:tcPr>
-          <w:p>
-            <w:pPr>
-              <w:spacing w:after="40"/>
-            </w:pPr>
-            <w:r>
-              <w:rPr>
-                <w:sz w:val="18"/>
-                <w:szCs w:val="18"/>
-              </w:rPr>
-              <w:t xml:space="preserve">[Name], Privacy Officer</w:t>
+            <w:shd w:fill="F7F7F7" w:color="auto" w:val="clear"/>
+            <w:tcMar>
+              <w:top w:type="dxa" w:w="60"/>
+              <w:left w:type="dxa" w:w="100"/>
+              <w:bottom w:type="dxa" w:w="60"/>
+              <w:right w:type="dxa" w:w="100"/>
+            </w:tcMar>
+            <w:vAlign w:val="top"/>
+          </w:tcPr>
+          <w:p>
+            <w:pPr>
+              <w:spacing w:after="40"/>
+            </w:pPr>
+            <w:r>
+              <w:rPr>
+                <w:b/>
+                <w:bCs/>
+                <w:sz w:val="18"/>
+                <w:szCs w:val="18"/>
+              </w:rPr>
+              <w:t xml:space="preserve">Privacy Officer</w:t>
             </w:r>
           </w:p>
         </w:tc>
         <w:tc>
           <w:tcPr>
             <w:tcW w:type="dxa" w:w="3600"/>
-            <w:tcMar>
-              <w:top w:type="dxa" w:w="60"/>
-              <w:left w:type="dxa" w:w="100"/>
-              <w:bottom w:type="dxa" w:w="60"/>
-              <w:right w:type="dxa" w:w="100"/>
-            </w:tcMar>
-            <w:vAlign w:val="top"/>
-          </w:tcPr>
-          <w:p>
-            <w:pPr>
-              <w:spacing w:after="40"/>
-            </w:pPr>
-            <w:r>
-              <w:rPr>
-                <w:sz w:val="18"/>
-                <w:szCs w:val="18"/>
-              </w:rPr>
-              <w:t xml:space="preserve"/>
+            <w:shd w:fill="F7F7F7" w:color="auto" w:val="clear"/>
+            <w:tcMar>
+              <w:top w:type="dxa" w:w="60"/>
+              <w:left w:type="dxa" w:w="100"/>
+              <w:bottom w:type="dxa" w:w="60"/>
+              <w:right w:type="dxa" w:w="100"/>
+            </w:tcMar>
+            <w:vAlign w:val="top"/>
+          </w:tcPr>
+          <w:p>
+            <w:pPr>
+              <w:spacing w:after="40"/>
+            </w:pPr>
+            <w:r>
+              <w:rPr>
+                <w:b w:val="false"/>
+                <w:bCs w:val="false"/>
+                <w:sz w:val="18"/>
+                <w:szCs w:val="18"/>
+              </w:rPr>
+              <w:t xml:space="preserve">[Name]</w:t>
             </w:r>
           </w:p>
         </w:tc>
         <w:tc>
           <w:tcPr>
             <w:tcW w:type="dxa" w:w="2360"/>
-            <w:tcMar>
-              <w:top w:type="dxa" w:w="60"/>
-              <w:left w:type="dxa" w:w="100"/>
-              <w:bottom w:type="dxa" w:w="60"/>
-              <w:right w:type="dxa" w:w="100"/>
-            </w:tcMar>
-            <w:vAlign w:val="top"/>
-          </w:tcPr>
-          <w:p>
-            <w:pPr>
-              <w:spacing w:after="40"/>
-            </w:pPr>
-            <w:r>
-              <w:rPr>
-                <w:sz w:val="18"/>
-                <w:szCs w:val="18"/>
-              </w:rPr>
-              <w:t xml:space="preserve"/>
+            <w:shd w:fill="F7F7F7" w:color="auto" w:val="clear"/>
+            <w:tcMar>
+              <w:top w:type="dxa" w:w="60"/>
+              <w:left w:type="dxa" w:w="100"/>
+              <w:bottom w:type="dxa" w:w="60"/>
+              <w:right w:type="dxa" w:w="100"/>
+            </w:tcMar>
+            <w:vAlign w:val="top"/>
+          </w:tcPr>
+          <w:p>
+            <w:pPr>
+              <w:spacing w:after="40"/>
+            </w:pPr>
+            <w:r>
+              <w:rPr>
+                <w:b w:val="false"/>
+                <w:bCs w:val="false"/>
+                <w:sz w:val="18"/>
+                <w:szCs w:val="18"/>
+              </w:rPr>
+              <w:t xml:space="preserve">[Date]</w:t>
             </w:r>
           </w:p>
         </w:tc>
       </w:tr>
       <w:tr>
-        <w:trPr>
-          <w:trHeight w:val="700" w:hRule="atLeast"/>
-        </w:trPr>
         <w:tc>
           <w:tcPr>
             <w:tcW w:type="dxa" w:w="3400"/>
@@ -2549,10 +2563,12 @@
             </w:pPr>
             <w:r>
               <w:rPr>
-                <w:sz w:val="18"/>
-                <w:szCs w:val="18"/>
-              </w:rPr>
-              <w:t xml:space="preserve">[Name], Security Officer</w:t>
+                <w:b/>
+                <w:bCs/>
+                <w:sz w:val="18"/>
+                <w:szCs w:val="18"/>
+              </w:rPr>
+              <w:t xml:space="preserve">Security Officer</w:t>
             </w:r>
           </w:p>
         </w:tc>
@@ -2573,10 +2589,12 @@
             </w:pPr>
             <w:r>
               <w:rPr>
-                <w:sz w:val="18"/>
-                <w:szCs w:val="18"/>
-              </w:rPr>
-              <w:t xml:space="preserve"/>
+                <w:b w:val="false"/>
+                <w:bCs w:val="false"/>
+                <w:sz w:val="18"/>
+                <w:szCs w:val="18"/>
+              </w:rPr>
+              <w:t xml:space="preserve">[Name]</w:t>
             </w:r>
           </w:p>
         </w:tc>
@@ -2597,10 +2615,12 @@
             </w:pPr>
             <w:r>
               <w:rPr>
-                <w:sz w:val="18"/>
-                <w:szCs w:val="18"/>
-              </w:rPr>
-              <w:t xml:space="preserve"/>
+                <w:b w:val="false"/>
+                <w:bCs w:val="false"/>
+                <w:sz w:val="18"/>
+                <w:szCs w:val="18"/>
+              </w:rPr>
+              <w:t xml:space="preserve">[Date]</w:t>
             </w:r>
           </w:p>
         </w:tc>
@@ -2983,7 +3003,7 @@
                 <w:sz w:val="18"/>
                 <w:szCs w:val="18"/>
               </w:rPr>
-              <w:t xml:space="preserve">Training completed and acknowledgment signed</w:t>
+              <w:t xml:space="preserve">Training completed in the assistant (or a paper completion recorded in the training log)</w:t>
             </w:r>
           </w:p>
         </w:tc>

</xml_diff>